<commit_message>
gitAuto manual push @ 2026-03-26 12:21:19
</commit_message>
<xml_diff>
--- a/docs/Report/网络管理与运维实践5 网络工程2301班-雷若奇-23053020134.docx
+++ b/docs/Report/网络管理与运维实践5 网络工程2301班-雷若奇-23053020134.docx
@@ -294,8 +294,6 @@
               </w:rPr>
               <w:t>雷若奇</w:t>
             </w:r>
-            <w:bookmarkStart w:id="0" w:name="_GoBack"/>
-            <w:bookmarkEnd w:id="0"/>
           </w:p>
         </w:tc>
       </w:tr>
@@ -352,8 +350,12 @@
     </w:p>
     <w:p>
       <w:pPr>
-        <w:rPr>
-          <w:rFonts w:hint="default" w:eastAsiaTheme="minorEastAsia"/>
+        <w:numPr>
+          <w:ilvl w:val="0"/>
+          <w:numId w:val="1"/>
+        </w:numPr>
+        <w:rPr>
+          <w:rFonts w:hint="eastAsia" w:eastAsiaTheme="minorEastAsia"/>
           <w:sz w:val="24"/>
           <w:szCs w:val="24"/>
           <w:lang w:val="en-US" w:eastAsia="zh-CN"/>
@@ -364,17 +366,126 @@
           <w:rFonts w:hint="eastAsia"/>
           <w:sz w:val="24"/>
           <w:szCs w:val="24"/>
-        </w:rPr>
-        <w:t>1.</w:t>
-      </w:r>
-      <w:r>
-        <w:rPr>
-          <w:rFonts w:hint="eastAsia"/>
-          <w:sz w:val="24"/>
-          <w:szCs w:val="24"/>
           <w:lang w:val="en-US" w:eastAsia="zh-CN"/>
         </w:rPr>
-        <w:t>步骤xxx</w:t>
+        <w:t>配置SZ1,SZ2</w:t>
+      </w:r>
+    </w:p>
+    <w:p>
+      <w:pPr>
+        <w:numPr>
+          <w:numId w:val="0"/>
+        </w:numPr>
+        <w:rPr>
+          <w:rFonts w:hint="eastAsia" w:eastAsiaTheme="minorEastAsia"/>
+          <w:sz w:val="24"/>
+          <w:szCs w:val="24"/>
+          <w:lang w:val="en-US" w:eastAsia="zh-CN"/>
+        </w:rPr>
+      </w:pPr>
+      <w:r>
+        <w:rPr>
+          <w:rFonts w:ascii="宋体" w:hAnsi="宋体" w:eastAsia="宋体" w:cs="宋体"/>
+          <w:sz w:val="24"/>
+          <w:szCs w:val="24"/>
+        </w:rPr>
+        <w:drawing>
+          <wp:inline distT="0" distB="0" distL="114300" distR="114300">
+            <wp:extent cx="5269865" cy="3587750"/>
+            <wp:effectExtent l="0" t="0" r="6985" b="12700"/>
+            <wp:docPr id="1" name="图片 1" descr="IMG_256"/>
+            <wp:cNvGraphicFramePr>
+              <a:graphicFrameLocks xmlns:a="http://schemas.openxmlformats.org/drawingml/2006/main" noChangeAspect="1"/>
+            </wp:cNvGraphicFramePr>
+            <a:graphic xmlns:a="http://schemas.openxmlformats.org/drawingml/2006/main">
+              <a:graphicData uri="http://schemas.openxmlformats.org/drawingml/2006/picture">
+                <pic:pic xmlns:pic="http://schemas.openxmlformats.org/drawingml/2006/picture">
+                  <pic:nvPicPr>
+                    <pic:cNvPr id="1" name="图片 1" descr="IMG_256"/>
+                    <pic:cNvPicPr>
+                      <a:picLocks noChangeAspect="1"/>
+                    </pic:cNvPicPr>
+                  </pic:nvPicPr>
+                  <pic:blipFill>
+                    <a:blip r:embed="rId4"/>
+                    <a:stretch>
+                      <a:fillRect/>
+                    </a:stretch>
+                  </pic:blipFill>
+                  <pic:spPr>
+                    <a:xfrm>
+                      <a:off x="0" y="0"/>
+                      <a:ext cx="5269865" cy="3587750"/>
+                    </a:xfrm>
+                    <a:prstGeom prst="rect">
+                      <a:avLst/>
+                    </a:prstGeom>
+                    <a:noFill/>
+                    <a:ln w="9525">
+                      <a:noFill/>
+                    </a:ln>
+                  </pic:spPr>
+                </pic:pic>
+              </a:graphicData>
+            </a:graphic>
+          </wp:inline>
+        </w:drawing>
+      </w:r>
+      <w:r>
+        <w:rPr>
+          <w:rFonts w:ascii="宋体" w:hAnsi="宋体" w:eastAsia="宋体" w:cs="宋体"/>
+          <w:sz w:val="24"/>
+          <w:szCs w:val="24"/>
+        </w:rPr>
+        <w:br w:type="textWrapping"/>
+      </w:r>
+      <w:r>
+        <w:rPr>
+          <w:rFonts w:ascii="宋体" w:hAnsi="宋体" w:eastAsia="宋体" w:cs="宋体"/>
+          <w:sz w:val="24"/>
+          <w:szCs w:val="24"/>
+        </w:rPr>
+        <w:drawing>
+          <wp:inline distT="0" distB="0" distL="114300" distR="114300">
+            <wp:extent cx="5269865" cy="3587750"/>
+            <wp:effectExtent l="0" t="0" r="6985" b="12700"/>
+            <wp:docPr id="2" name="图片 2" descr="IMG_256"/>
+            <wp:cNvGraphicFramePr>
+              <a:graphicFrameLocks xmlns:a="http://schemas.openxmlformats.org/drawingml/2006/main" noChangeAspect="1"/>
+            </wp:cNvGraphicFramePr>
+            <a:graphic xmlns:a="http://schemas.openxmlformats.org/drawingml/2006/main">
+              <a:graphicData uri="http://schemas.openxmlformats.org/drawingml/2006/picture">
+                <pic:pic xmlns:pic="http://schemas.openxmlformats.org/drawingml/2006/picture">
+                  <pic:nvPicPr>
+                    <pic:cNvPr id="2" name="图片 2" descr="IMG_256"/>
+                    <pic:cNvPicPr>
+                      <a:picLocks noChangeAspect="1"/>
+                    </pic:cNvPicPr>
+                  </pic:nvPicPr>
+                  <pic:blipFill>
+                    <a:blip r:embed="rId5"/>
+                    <a:stretch>
+                      <a:fillRect/>
+                    </a:stretch>
+                  </pic:blipFill>
+                  <pic:spPr>
+                    <a:xfrm>
+                      <a:off x="0" y="0"/>
+                      <a:ext cx="5269865" cy="3587750"/>
+                    </a:xfrm>
+                    <a:prstGeom prst="rect">
+                      <a:avLst/>
+                    </a:prstGeom>
+                    <a:noFill/>
+                    <a:ln w="9525">
+                      <a:noFill/>
+                    </a:ln>
+                  </pic:spPr>
+                </pic:pic>
+              </a:graphicData>
+            </a:graphic>
+          </wp:inline>
+        </w:drawing>
       </w:r>
     </w:p>
     <w:p>
@@ -387,34 +498,272 @@
     </w:p>
     <w:p>
       <w:pPr>
-        <w:rPr>
-          <w:sz w:val="24"/>
-          <w:szCs w:val="24"/>
+        <w:numPr>
+          <w:ilvl w:val="0"/>
+          <w:numId w:val="1"/>
+        </w:numPr>
+        <w:ind w:left="0" w:leftChars="0" w:firstLine="0" w:firstLineChars="0"/>
+        <w:rPr>
+          <w:rFonts w:hint="eastAsia" w:eastAsiaTheme="minorEastAsia"/>
+          <w:sz w:val="24"/>
+          <w:szCs w:val="24"/>
+          <w:lang w:val="en-US" w:eastAsia="zh-CN"/>
         </w:rPr>
       </w:pPr>
       <w:r>
         <w:rPr>
-          <w:sz w:val="24"/>
-          <w:szCs w:val="24"/>
-        </w:rPr>
-        <w:t>2</w:t>
-      </w:r>
-      <w:r>
-        <w:rPr>
           <w:rFonts w:hint="eastAsia"/>
           <w:sz w:val="24"/>
           <w:szCs w:val="24"/>
-        </w:rPr>
-        <w:t>.</w:t>
+          <w:lang w:val="en-US" w:eastAsia="zh-CN"/>
+        </w:rPr>
+        <w:t>配置MIB Browser并查询OID</w:t>
+      </w:r>
+    </w:p>
+    <w:p>
+      <w:r>
+        <w:drawing>
+          <wp:inline distT="0" distB="0" distL="114300" distR="114300">
+            <wp:extent cx="3307715" cy="3988435"/>
+            <wp:effectExtent l="0" t="0" r="6985" b="12065"/>
+            <wp:docPr id="3" name="图片 3"/>
+            <wp:cNvGraphicFramePr>
+              <a:graphicFrameLocks xmlns:a="http://schemas.openxmlformats.org/drawingml/2006/main" noChangeAspect="1"/>
+            </wp:cNvGraphicFramePr>
+            <a:graphic xmlns:a="http://schemas.openxmlformats.org/drawingml/2006/main">
+              <a:graphicData uri="http://schemas.openxmlformats.org/drawingml/2006/picture">
+                <pic:pic xmlns:pic="http://schemas.openxmlformats.org/drawingml/2006/picture">
+                  <pic:nvPicPr>
+                    <pic:cNvPr id="3" name="图片 3"/>
+                    <pic:cNvPicPr>
+                      <a:picLocks noChangeAspect="1"/>
+                    </pic:cNvPicPr>
+                  </pic:nvPicPr>
+                  <pic:blipFill>
+                    <a:blip r:embed="rId6"/>
+                    <a:stretch>
+                      <a:fillRect/>
+                    </a:stretch>
+                  </pic:blipFill>
+                  <pic:spPr>
+                    <a:xfrm>
+                      <a:off x="0" y="0"/>
+                      <a:ext cx="3307715" cy="3988435"/>
+                    </a:xfrm>
+                    <a:prstGeom prst="rect">
+                      <a:avLst/>
+                    </a:prstGeom>
+                    <a:noFill/>
+                    <a:ln>
+                      <a:noFill/>
+                    </a:ln>
+                  </pic:spPr>
+                </pic:pic>
+              </a:graphicData>
+            </a:graphic>
+          </wp:inline>
+        </w:drawing>
+      </w:r>
+    </w:p>
+    <w:p>
+      <w:r>
+        <w:drawing>
+          <wp:inline distT="0" distB="0" distL="114300" distR="114300">
+            <wp:extent cx="5268595" cy="5414010"/>
+            <wp:effectExtent l="0" t="0" r="8255" b="15240"/>
+            <wp:docPr id="4" name="图片 4"/>
+            <wp:cNvGraphicFramePr>
+              <a:graphicFrameLocks xmlns:a="http://schemas.openxmlformats.org/drawingml/2006/main" noChangeAspect="1"/>
+            </wp:cNvGraphicFramePr>
+            <a:graphic xmlns:a="http://schemas.openxmlformats.org/drawingml/2006/main">
+              <a:graphicData uri="http://schemas.openxmlformats.org/drawingml/2006/picture">
+                <pic:pic xmlns:pic="http://schemas.openxmlformats.org/drawingml/2006/picture">
+                  <pic:nvPicPr>
+                    <pic:cNvPr id="4" name="图片 4"/>
+                    <pic:cNvPicPr>
+                      <a:picLocks noChangeAspect="1"/>
+                    </pic:cNvPicPr>
+                  </pic:nvPicPr>
+                  <pic:blipFill>
+                    <a:blip r:embed="rId7"/>
+                    <a:stretch>
+                      <a:fillRect/>
+                    </a:stretch>
+                  </pic:blipFill>
+                  <pic:spPr>
+                    <a:xfrm>
+                      <a:off x="0" y="0"/>
+                      <a:ext cx="5268595" cy="5414010"/>
+                    </a:xfrm>
+                    <a:prstGeom prst="rect">
+                      <a:avLst/>
+                    </a:prstGeom>
+                    <a:noFill/>
+                    <a:ln>
+                      <a:noFill/>
+                    </a:ln>
+                  </pic:spPr>
+                </pic:pic>
+              </a:graphicData>
+            </a:graphic>
+          </wp:inline>
+        </w:drawing>
+      </w:r>
+    </w:p>
+    <w:p/>
+    <w:p>
+      <w:pPr>
+        <w:numPr>
+          <w:ilvl w:val="0"/>
+          <w:numId w:val="1"/>
+        </w:numPr>
+        <w:ind w:left="0" w:leftChars="0" w:firstLine="0" w:firstLineChars="0"/>
+        <w:rPr>
+          <w:rFonts w:hint="eastAsia" w:eastAsiaTheme="minorEastAsia"/>
+          <w:sz w:val="24"/>
+          <w:szCs w:val="24"/>
+          <w:lang w:val="en-US" w:eastAsia="zh-CN"/>
+        </w:rPr>
+      </w:pPr>
+      <w:r>
+        <w:rPr>
+          <w:rFonts w:hint="eastAsia"/>
+          <w:sz w:val="24"/>
+          <w:szCs w:val="24"/>
+          <w:lang w:val="en-US" w:eastAsia="zh-CN"/>
+        </w:rPr>
+        <w:t>编写oid_string.csv</w:t>
+      </w:r>
+      <w:r>
+        <w:rPr>
+          <w:rFonts w:hint="eastAsia"/>
+          <w:sz w:val="24"/>
+          <w:szCs w:val="24"/>
+          <w:lang w:val="en-US" w:eastAsia="zh-CN"/>
+        </w:rPr>
+        <w:br w:type="textWrapping"/>
+      </w:r>
+      <w:r>
+        <w:drawing>
+          <wp:inline distT="0" distB="0" distL="114300" distR="114300">
+            <wp:extent cx="4387215" cy="2463800"/>
+            <wp:effectExtent l="0" t="0" r="13335" b="12700"/>
+            <wp:docPr id="6" name="图片 6"/>
+            <wp:cNvGraphicFramePr>
+              <a:graphicFrameLocks xmlns:a="http://schemas.openxmlformats.org/drawingml/2006/main" noChangeAspect="1"/>
+            </wp:cNvGraphicFramePr>
+            <a:graphic xmlns:a="http://schemas.openxmlformats.org/drawingml/2006/main">
+              <a:graphicData uri="http://schemas.openxmlformats.org/drawingml/2006/picture">
+                <pic:pic xmlns:pic="http://schemas.openxmlformats.org/drawingml/2006/picture">
+                  <pic:nvPicPr>
+                    <pic:cNvPr id="6" name="图片 6"/>
+                    <pic:cNvPicPr>
+                      <a:picLocks noChangeAspect="1"/>
+                    </pic:cNvPicPr>
+                  </pic:nvPicPr>
+                  <pic:blipFill>
+                    <a:blip r:embed="rId8"/>
+                    <a:stretch>
+                      <a:fillRect/>
+                    </a:stretch>
+                  </pic:blipFill>
+                  <pic:spPr>
+                    <a:xfrm>
+                      <a:off x="0" y="0"/>
+                      <a:ext cx="4387215" cy="2463800"/>
+                    </a:xfrm>
+                    <a:prstGeom prst="rect">
+                      <a:avLst/>
+                    </a:prstGeom>
+                    <a:noFill/>
+                    <a:ln>
+                      <a:noFill/>
+                    </a:ln>
+                  </pic:spPr>
+                </pic:pic>
+              </a:graphicData>
+            </a:graphic>
+          </wp:inline>
+        </w:drawing>
       </w:r>
     </w:p>
     <w:p>
       <w:pPr>
-        <w:rPr>
-          <w:sz w:val="24"/>
-          <w:szCs w:val="24"/>
+        <w:numPr>
+          <w:ilvl w:val="0"/>
+          <w:numId w:val="1"/>
+        </w:numPr>
+        <w:ind w:left="0" w:leftChars="0" w:firstLine="0" w:firstLineChars="0"/>
+        <w:rPr>
+          <w:rFonts w:hint="eastAsia" w:eastAsiaTheme="minorEastAsia"/>
+          <w:sz w:val="24"/>
+          <w:szCs w:val="24"/>
+          <w:lang w:val="en-US" w:eastAsia="zh-CN"/>
         </w:rPr>
       </w:pPr>
+      <w:r>
+        <w:rPr>
+          <w:rFonts w:hint="eastAsia"/>
+          <w:sz w:val="24"/>
+          <w:szCs w:val="24"/>
+          <w:lang w:val="en-US" w:eastAsia="zh-CN"/>
+        </w:rPr>
+        <w:t>运行代码</w:t>
+      </w:r>
+      <w:r>
+        <w:rPr>
+          <w:rFonts w:hint="eastAsia"/>
+          <w:sz w:val="24"/>
+          <w:szCs w:val="24"/>
+          <w:lang w:val="en-US" w:eastAsia="zh-CN"/>
+        </w:rPr>
+        <w:br w:type="textWrapping"/>
+      </w:r>
+      <w:r>
+        <w:drawing>
+          <wp:inline distT="0" distB="0" distL="114300" distR="114300">
+            <wp:extent cx="5266690" cy="2957195"/>
+            <wp:effectExtent l="0" t="0" r="10160" b="14605"/>
+            <wp:docPr id="7" name="图片 7"/>
+            <wp:cNvGraphicFramePr>
+              <a:graphicFrameLocks xmlns:a="http://schemas.openxmlformats.org/drawingml/2006/main" noChangeAspect="1"/>
+            </wp:cNvGraphicFramePr>
+            <a:graphic xmlns:a="http://schemas.openxmlformats.org/drawingml/2006/main">
+              <a:graphicData uri="http://schemas.openxmlformats.org/drawingml/2006/picture">
+                <pic:pic xmlns:pic="http://schemas.openxmlformats.org/drawingml/2006/picture">
+                  <pic:nvPicPr>
+                    <pic:cNvPr id="7" name="图片 7"/>
+                    <pic:cNvPicPr>
+                      <a:picLocks noChangeAspect="1"/>
+                    </pic:cNvPicPr>
+                  </pic:nvPicPr>
+                  <pic:blipFill>
+                    <a:blip r:embed="rId9"/>
+                    <a:stretch>
+                      <a:fillRect/>
+                    </a:stretch>
+                  </pic:blipFill>
+                  <pic:spPr>
+                    <a:xfrm>
+                      <a:off x="0" y="0"/>
+                      <a:ext cx="5266690" cy="2957195"/>
+                    </a:xfrm>
+                    <a:prstGeom prst="rect">
+                      <a:avLst/>
+                    </a:prstGeom>
+                    <a:noFill/>
+                    <a:ln>
+                      <a:noFill/>
+                    </a:ln>
+                  </pic:spPr>
+                </pic:pic>
+              </a:graphicData>
+            </a:graphic>
+          </wp:inline>
+        </w:drawing>
+      </w:r>
+      <w:bookmarkStart w:id="0" w:name="_GoBack"/>
+      <w:bookmarkEnd w:id="0"/>
     </w:p>
     <w:p>
       <w:pPr>
@@ -423,38 +772,6 @@
           <w:szCs w:val="24"/>
         </w:rPr>
       </w:pPr>
-      <w:r>
-        <w:rPr>
-          <w:rFonts w:hint="eastAsia"/>
-          <w:sz w:val="24"/>
-          <w:szCs w:val="24"/>
-        </w:rPr>
-        <w:t>3.</w:t>
-      </w:r>
-    </w:p>
-    <w:p>
-      <w:pPr>
-        <w:rPr>
-          <w:sz w:val="24"/>
-          <w:szCs w:val="24"/>
-        </w:rPr>
-      </w:pPr>
-    </w:p>
-    <w:p>
-      <w:pPr>
-        <w:rPr>
-          <w:sz w:val="24"/>
-          <w:szCs w:val="24"/>
-        </w:rPr>
-      </w:pPr>
-      <w:r>
-        <w:rPr>
-          <w:rFonts w:hint="eastAsia"/>
-          <w:sz w:val="24"/>
-          <w:szCs w:val="24"/>
-        </w:rPr>
-        <w:t>。。。。</w:t>
-      </w:r>
     </w:p>
     <w:tbl>
       <w:tblPr>
@@ -663,6 +980,26 @@
     </w:sectPr>
   </w:body>
 </w:document>
+</file>
+
+<file path=word/numbering.xml><?xml version="1.0" encoding="utf-8"?>
+<w:numbering xmlns:wpc="http://schemas.microsoft.com/office/word/2010/wordprocessingCanvas" xmlns:mc="http://schemas.openxmlformats.org/markup-compatibility/2006" xmlns:o="urn:schemas-microsoft-com:office:office" xmlns:r="http://schemas.openxmlformats.org/officeDocument/2006/relationships" xmlns:m="http://schemas.openxmlformats.org/officeDocument/2006/math" xmlns:v="urn:schemas-microsoft-com:vml" xmlns:wp14="http://schemas.microsoft.com/office/word/2010/wordprocessingDrawing" xmlns:wp="http://schemas.openxmlformats.org/drawingml/2006/wordprocessingDrawing" xmlns:w10="urn:schemas-microsoft-com:office:word" xmlns:w="http://schemas.openxmlformats.org/wordprocessingml/2006/main" xmlns:w14="http://schemas.microsoft.com/office/word/2010/wordml" xmlns:wpg="http://schemas.microsoft.com/office/word/2010/wordprocessingGroup" xmlns:wpi="http://schemas.microsoft.com/office/word/2010/wordprocessingInk" xmlns:wne="http://schemas.microsoft.com/office/word/2006/wordml" xmlns:wps="http://schemas.microsoft.com/office/word/2010/wordprocessingShape" xmlns:wpsCustomData="http://www.wps.cn/officeDocument/2013/wpsCustomData" mc:Ignorable="w14 wp14">
+  <w:abstractNum w:abstractNumId="0">
+    <w:nsid w:val="8277F2E1"/>
+    <w:multiLevelType w:val="singleLevel"/>
+    <w:tmpl w:val="8277F2E1"/>
+    <w:lvl w:ilvl="0" w:tentative="0">
+      <w:start w:val="1"/>
+      <w:numFmt w:val="decimal"/>
+      <w:suff w:val="space"/>
+      <w:lvlText w:val="%1."/>
+      <w:lvlJc w:val="left"/>
+    </w:lvl>
+  </w:abstractNum>
+  <w:num w:numId="1">
+    <w:abstractNumId w:val="0"/>
+  </w:num>
+</w:numbering>
 </file>
 
 <file path=word/styles.xml><?xml version="1.0" encoding="utf-8"?>

</xml_diff>